<commit_message>
Docs: log the monorepo TypeScript build fix (2026-07-21 push)
Updates CHANGE_LOG, DATABASE_CHANGE_LOG, OPERATIONS_GUIDE,
MASTER_PRODUCT_DOCUMENT, BACKLOG, and the Solution Handover doc/PDF
to record the build-config fix merged in commit 455046e. Adds the
dated docs/2026-07-21 archive folder per the standard push workflow.
</commit_message>
<xml_diff>
--- a/docs/Solution-Handover-2026-06-22.docx
+++ b/docs/Solution-Handover-2026-06-22.docx
@@ -3764,6 +3764,80 @@
       </w:pPr>
       <w:r>
         <w:t>Verified via direct simulation and live API tests before this fix was shipped.</w:t>
+      </w:r>
+    </w:p>
+    <w:p>
+      <w:pPr>
+        <w:pStyle w:val="2"/>
+      </w:pPr>
+      <w:r>
+        <w:t>15.  Update — 2026-07-21: Monorepo Build Reliability Fix</w:t>
+      </w:r>
+    </w:p>
+    <w:p>
+      <w:pPr/>
+      <w:r>
+        <w:t>An internal safety-net fix — the platform's TypeScript type-checker had never been run cleanly across most of the backend, since production runs via a tool that skips type-checking entirely. Fixed in a controlled, isolated way; two small real bugs were found and fixed along the way.</w:t>
+      </w:r>
+    </w:p>
+    <w:p>
+      <w:pPr>
+        <w:pStyle w:val="16"/>
+        <w:numPr>
+          <w:ilvl w:val="0"/>
+          <w:numId w:val="1"/>
+        </w:numPr>
+      </w:pPr>
+      <w:r>
+        <w:t>Fixed the full TypeScript build across the API server, core services, and all 11 backend modules — previously none of these had ever been individually type-checked, so real mistakes could have hidden undetected.</w:t>
+      </w:r>
+    </w:p>
+    <w:p>
+      <w:pPr>
+        <w:pStyle w:val="16"/>
+        <w:numPr>
+          <w:ilvl w:val="0"/>
+          <w:numId w:val="1"/>
+        </w:numPr>
+      </w:pPr>
+      <w:r>
+        <w:t>Done safely: created a separate branch, took a safety backup (git tag + full solution zip) before starting, tested thoroughly, and only merged into the main codebase once fully verified — no risk taken with the live, working solution.</w:t>
+      </w:r>
+    </w:p>
+    <w:p>
+      <w:pPr>
+        <w:pStyle w:val="16"/>
+        <w:numPr>
+          <w:ilvl w:val="0"/>
+          <w:numId w:val="1"/>
+        </w:numPr>
+      </w:pPr>
+      <w:r>
+        <w:t>Found and fixed two small real bugs while doing this: emails sent from the platform weren't correctly recording which staff member sent them, and one internal notification was silently failing to fire — both now fixed.</w:t>
+      </w:r>
+    </w:p>
+    <w:p>
+      <w:pPr>
+        <w:pStyle w:val="16"/>
+        <w:numPr>
+          <w:ilvl w:val="0"/>
+          <w:numId w:val="1"/>
+        </w:numPr>
+      </w:pPr>
+      <w:r>
+        <w:t>Confirmed (separately, not yet fixed) that the live-call-audio-streaming feature has never actually worked, because a required plugin was never installed — logged as its own follow-up item, not part of this fix.</w:t>
+      </w:r>
+    </w:p>
+    <w:p>
+      <w:pPr>
+        <w:pStyle w:val="16"/>
+        <w:numPr>
+          <w:ilvl w:val="0"/>
+          <w:numId w:val="1"/>
+        </w:numPr>
+      </w:pPr>
+      <w:r>
+        <w:t>No changes to the database, no changes to what any user sees or does — this was entirely a behind-the-scenes reliability and code-quality fix.</w:t>
       </w:r>
     </w:p>
     <w:sectPr>

</xml_diff>